<commit_message>
Genetic Sex figure added
</commit_message>
<xml_diff>
--- a/FinalReport2025/Backwater Demographics Draft Sept 2025.docx
+++ b/FinalReport2025/Backwater Demographics Draft Sept 2025.docx
@@ -9,25 +9,7 @@
     </w:p>
     <w:p>
       <w:r>
-        <w:t xml:space="preserve">Records for PIT tagged RASU and BONY stocked, </w:t>
-      </w:r>
-      <w:r>
-        <w:t>capture</w:t>
-      </w:r>
-      <w:r>
-        <w:t>d, or remotely contacted (PIT scanned) within Imperial Ponds or Yuma Cove backwater</w:t>
-      </w:r>
-      <w:r>
-        <w:t xml:space="preserve">, </w:t>
-      </w:r>
-      <w:r>
-        <w:t xml:space="preserve">or </w:t>
-      </w:r>
-      <w:r>
-        <w:t>transfer</w:t>
-      </w:r>
-      <w:r>
-        <w:t xml:space="preserve">red out of same, were filtered from the </w:t>
+        <w:t xml:space="preserve">Records for PIT tagged RASU and BONY stocked, captured, or remotely contacted (PIT scanned) within Imperial Ponds or Yuma Cove backwater, or transferred out of same, were filtered from the </w:t>
       </w:r>
       <w:r>
         <w:t>Lower Colorado River Native Fishes Database (hereon referred to as “the database”</w:t>
@@ -779,7 +761,15 @@
     </w:p>
     <w:p>
       <w:r>
-        <w:t>IPCA ponds with razorback sucker had similar results</w:t>
+        <w:t xml:space="preserve">IPCA ponds with razorback </w:t>
+      </w:r>
+      <w:proofErr w:type="gramStart"/>
+      <w:r>
+        <w:t>sucker</w:t>
+      </w:r>
+      <w:proofErr w:type="gramEnd"/>
+      <w:r>
+        <w:t xml:space="preserve"> had similar results</w:t>
       </w:r>
       <w:r>
         <w:t xml:space="preserve"> and </w:t>
@@ -1320,6 +1310,55 @@
       </w:r>
     </w:p>
     <w:p/>
+    <w:p>
+      <w:r>
+        <w:rPr>
+          <w:noProof/>
+        </w:rPr>
+        <w:lastRenderedPageBreak/>
+        <w:drawing>
+          <wp:inline distT="0" distB="0" distL="0" distR="0" wp14:anchorId="1645775A" wp14:editId="0BD649D9">
+            <wp:extent cx="5868063" cy="3912042"/>
+            <wp:effectExtent l="0" t="0" r="0" b="0"/>
+            <wp:docPr id="358630128" name="Picture 2"/>
+            <wp:cNvGraphicFramePr>
+              <a:graphicFrameLocks xmlns:a="http://schemas.openxmlformats.org/drawingml/2006/main" noChangeAspect="1"/>
+            </wp:cNvGraphicFramePr>
+            <a:graphic xmlns:a="http://schemas.openxmlformats.org/drawingml/2006/main">
+              <a:graphicData uri="http://schemas.openxmlformats.org/drawingml/2006/picture">
+                <pic:pic xmlns:pic="http://schemas.openxmlformats.org/drawingml/2006/picture">
+                  <pic:nvPicPr>
+                    <pic:cNvPr id="358630128" name="Picture 358630128"/>
+                    <pic:cNvPicPr/>
+                  </pic:nvPicPr>
+                  <pic:blipFill>
+                    <a:blip r:embed="rId18" cstate="print">
+                      <a:extLst>
+                        <a:ext uri="{28A0092B-C50C-407E-A947-70E740481C1C}">
+                          <a14:useLocalDpi xmlns:a14="http://schemas.microsoft.com/office/drawing/2010/main" val="0"/>
+                        </a:ext>
+                      </a:extLst>
+                    </a:blip>
+                    <a:stretch>
+                      <a:fillRect/>
+                    </a:stretch>
+                  </pic:blipFill>
+                  <pic:spPr>
+                    <a:xfrm>
+                      <a:off x="0" y="0"/>
+                      <a:ext cx="5872173" cy="3914782"/>
+                    </a:xfrm>
+                    <a:prstGeom prst="rect">
+                      <a:avLst/>
+                    </a:prstGeom>
+                  </pic:spPr>
+                </pic:pic>
+              </a:graphicData>
+            </a:graphic>
+          </wp:inline>
+        </w:drawing>
+      </w:r>
+    </w:p>
     <w:sectPr>
       <w:pgSz w:w="12240" w:h="15840"/>
       <w:pgMar w:top="1440" w:right="1440" w:bottom="1440" w:left="1440" w:header="720" w:footer="720" w:gutter="0"/>
@@ -2662,6 +2701,26 @@
 </file>
 
 <file path=customXml/item1.xml><?xml version="1.0" encoding="utf-8"?>
+<?mso-contentType ?>
+<FormTemplates xmlns="http://schemas.microsoft.com/sharepoint/v3/contenttype/forms">
+  <Display>DocumentLibraryForm</Display>
+  <Edit>DocumentLibraryForm</Edit>
+  <New>DocumentLibraryForm</New>
+</FormTemplates>
+</file>
+
+<file path=customXml/item2.xml><?xml version="1.0" encoding="utf-8"?>
+<p:properties xmlns:p="http://schemas.microsoft.com/office/2006/metadata/properties" xmlns:xsi="http://www.w3.org/2001/XMLSchema-instance" xmlns:pc="http://schemas.microsoft.com/office/infopath/2007/PartnerControls">
+  <documentManagement>
+    <lcf76f155ced4ddcb4097134ff3c332f xmlns="0163b7c3-6fd4-4e9e-a0e0-ce73f2749c4b">
+      <Terms xmlns="http://schemas.microsoft.com/office/infopath/2007/PartnerControls"/>
+    </lcf76f155ced4ddcb4097134ff3c332f>
+    <TaxCatchAll xmlns="d1e10837-682d-47d3-817a-d9a92e4874a6" xsi:nil="true"/>
+  </documentManagement>
+</p:properties>
+</file>
+
+<file path=customXml/item3.xml><?xml version="1.0" encoding="utf-8"?>
 <ct:contentTypeSchema xmlns:ct="http://schemas.microsoft.com/office/2006/metadata/contentType" xmlns:ma="http://schemas.microsoft.com/office/2006/metadata/properties/metaAttributes" ct:_="" ma:_="" ma:contentTypeName="Document" ma:contentTypeID="0x010100CF451DEAB66511499DA003356CF88131" ma:contentTypeVersion="16" ma:contentTypeDescription="Create a new document." ma:contentTypeScope="" ma:versionID="38be41802eec72d376469eb8b893067b">
   <xsd:schema xmlns:xsd="http://www.w3.org/2001/XMLSchema" xmlns:xs="http://www.w3.org/2001/XMLSchema" xmlns:p="http://schemas.microsoft.com/office/2006/metadata/properties" xmlns:ns2="0163b7c3-6fd4-4e9e-a0e0-ce73f2749c4b" xmlns:ns3="d1e10837-682d-47d3-817a-d9a92e4874a6" targetNamespace="http://schemas.microsoft.com/office/2006/metadata/properties" ma:root="true" ma:fieldsID="6567375de3acbf3c6eaeedd45f4249a6" ns2:_="" ns3:_="">
     <xsd:import namespace="0163b7c3-6fd4-4e9e-a0e0-ce73f2749c4b"/>
@@ -2904,27 +2963,26 @@
 </ct:contentTypeSchema>
 </file>
 
-<file path=customXml/item2.xml><?xml version="1.0" encoding="utf-8"?>
-<p:properties xmlns:p="http://schemas.microsoft.com/office/2006/metadata/properties" xmlns:xsi="http://www.w3.org/2001/XMLSchema-instance" xmlns:pc="http://schemas.microsoft.com/office/infopath/2007/PartnerControls">
-  <documentManagement>
-    <lcf76f155ced4ddcb4097134ff3c332f xmlns="0163b7c3-6fd4-4e9e-a0e0-ce73f2749c4b">
-      <Terms xmlns="http://schemas.microsoft.com/office/infopath/2007/PartnerControls"/>
-    </lcf76f155ced4ddcb4097134ff3c332f>
-    <TaxCatchAll xmlns="d1e10837-682d-47d3-817a-d9a92e4874a6" xsi:nil="true"/>
-  </documentManagement>
-</p:properties>
+<file path=customXml/itemProps1.xml><?xml version="1.0" encoding="utf-8"?>
+<ds:datastoreItem xmlns:ds="http://schemas.openxmlformats.org/officeDocument/2006/customXml" ds:itemID="{7CCFAC32-F609-4E33-A54F-449EC8A499E7}">
+  <ds:schemaRefs>
+    <ds:schemaRef ds:uri="http://schemas.microsoft.com/sharepoint/v3/contenttype/forms"/>
+  </ds:schemaRefs>
+</ds:datastoreItem>
 </file>
 
-<file path=customXml/item3.xml><?xml version="1.0" encoding="utf-8"?>
-<?mso-contentType ?>
-<FormTemplates xmlns="http://schemas.microsoft.com/sharepoint/v3/contenttype/forms">
-  <Display>DocumentLibraryForm</Display>
-  <Edit>DocumentLibraryForm</Edit>
-  <New>DocumentLibraryForm</New>
-</FormTemplates>
+<file path=customXml/itemProps2.xml><?xml version="1.0" encoding="utf-8"?>
+<ds:datastoreItem xmlns:ds="http://schemas.openxmlformats.org/officeDocument/2006/customXml" ds:itemID="{90B9D941-B8C9-4E68-B03F-BAD8B486BB09}">
+  <ds:schemaRefs>
+    <ds:schemaRef ds:uri="http://schemas.microsoft.com/office/2006/metadata/properties"/>
+    <ds:schemaRef ds:uri="http://schemas.microsoft.com/office/infopath/2007/PartnerControls"/>
+    <ds:schemaRef ds:uri="0163b7c3-6fd4-4e9e-a0e0-ce73f2749c4b"/>
+    <ds:schemaRef ds:uri="d1e10837-682d-47d3-817a-d9a92e4874a6"/>
+  </ds:schemaRefs>
+</ds:datastoreItem>
 </file>
 
-<file path=customXml/itemProps1.xml><?xml version="1.0" encoding="utf-8"?>
+<file path=customXml/itemProps3.xml><?xml version="1.0" encoding="utf-8"?>
 <ds:datastoreItem xmlns:ds="http://schemas.openxmlformats.org/officeDocument/2006/customXml" ds:itemID="{F5C49A08-F191-4D37-AA2C-32CF2EDCD473}">
   <ds:schemaRefs>
     <ds:schemaRef ds:uri="http://schemas.microsoft.com/office/2006/metadata/contentType"/>
@@ -2941,23 +2999,4 @@
     <ds:schemaRef ds:uri="http://schemas.microsoft.com/internal/obd"/>
   </ds:schemaRefs>
 </ds:datastoreItem>
-</file>
-
-<file path=customXml/itemProps2.xml><?xml version="1.0" encoding="utf-8"?>
-<ds:datastoreItem xmlns:ds="http://schemas.openxmlformats.org/officeDocument/2006/customXml" ds:itemID="{90B9D941-B8C9-4E68-B03F-BAD8B486BB09}">
-  <ds:schemaRefs>
-    <ds:schemaRef ds:uri="http://schemas.microsoft.com/office/2006/metadata/properties"/>
-    <ds:schemaRef ds:uri="http://schemas.microsoft.com/office/infopath/2007/PartnerControls"/>
-    <ds:schemaRef ds:uri="0163b7c3-6fd4-4e9e-a0e0-ce73f2749c4b"/>
-    <ds:schemaRef ds:uri="d1e10837-682d-47d3-817a-d9a92e4874a6"/>
-  </ds:schemaRefs>
-</ds:datastoreItem>
-</file>
-
-<file path=customXml/itemProps3.xml><?xml version="1.0" encoding="utf-8"?>
-<ds:datastoreItem xmlns:ds="http://schemas.openxmlformats.org/officeDocument/2006/customXml" ds:itemID="{7CCFAC32-F609-4E33-A54F-449EC8A499E7}">
-  <ds:schemaRefs>
-    <ds:schemaRef ds:uri="http://schemas.microsoft.com/sharepoint/v3/contenttype/forms"/>
-  </ds:schemaRefs>
-</ds:datastoreItem>
 </file>
</xml_diff>